<commit_message>
Se realizan ajustes para integrar cotizaciones
</commit_message>
<xml_diff>
--- a/Documentación/Manual de Configuración – AVS_ZohoIntegration.docx
+++ b/Documentación/Manual de Configuración – AVS_ZohoIntegration.docx
@@ -159,7 +159,6 @@
           <w:lang w:val="es-419"/>
         </w:rPr>
       </w:pPr>
-      <w:proofErr w:type="spellStart"/>
       <w:r>
         <w:rPr>
           <w:sz w:val="32"/>
@@ -167,7 +166,6 @@
         </w:rPr>
         <w:t>AVS_ZohoIntegration</w:t>
       </w:r>
-      <w:proofErr w:type="spellEnd"/>
     </w:p>
     <w:p>
       <w:pPr>
@@ -254,7 +252,7 @@
         <w:rPr>
           <w:lang w:val="es-419"/>
         </w:rPr>
-        <w:t>1</w:t>
+        <w:t>4</w:t>
       </w:r>
       <w:r>
         <w:rPr>
@@ -2703,21 +2701,7 @@
         <w:rPr>
           <w:lang w:val="es-MX"/>
         </w:rPr>
-        <w:t xml:space="preserve">Mapeo de campos principales y configuración de </w:t>
-      </w:r>
-      <w:proofErr w:type="spellStart"/>
-      <w:r>
-        <w:rPr>
-          <w:lang w:val="es-MX"/>
-        </w:rPr>
-        <w:t>subnodos</w:t>
-      </w:r>
-      <w:proofErr w:type="spellEnd"/>
-      <w:r>
-        <w:rPr>
-          <w:lang w:val="es-MX"/>
-        </w:rPr>
-        <w:t xml:space="preserve"> (el detalle o las líneas de los documentos) entre ambos sistemas.</w:t>
+        <w:t>Mapeo de campos principales y configuración de subnodos (el detalle o las líneas de los documentos) entre ambos sistemas.</w:t>
       </w:r>
     </w:p>
     <w:p>
@@ -2752,21 +2736,7 @@
           <w:lang w:val="es-MX"/>
         </w:rPr>
         <w:lastRenderedPageBreak/>
-        <w:t xml:space="preserve">Instalación inicial del software de integración o configuración de </w:t>
-      </w:r>
-      <w:proofErr w:type="spellStart"/>
-      <w:r>
-        <w:rPr>
-          <w:lang w:val="es-MX"/>
-        </w:rPr>
-        <w:t>pre-requisitos</w:t>
-      </w:r>
-      <w:proofErr w:type="spellEnd"/>
-      <w:r>
-        <w:rPr>
-          <w:lang w:val="es-MX"/>
-        </w:rPr>
-        <w:t xml:space="preserve"> técnicos en servidores (como SAP DI API o SQL Server).</w:t>
+        <w:t>Instalación inicial del software de integración o configuración de pre-requisitos técnicos en servidores (como SAP DI API o SQL Server).</w:t>
       </w:r>
     </w:p>
     <w:p>
@@ -3139,23 +3109,13 @@
         </w:rPr>
         <w:t xml:space="preserve"> y el </w:t>
       </w:r>
-      <w:proofErr w:type="spellStart"/>
       <w:r>
         <w:rPr>
           <w:i/>
           <w:iCs/>
           <w:lang w:val="es-MX"/>
         </w:rPr>
-        <w:t>Refresh</w:t>
-      </w:r>
-      <w:proofErr w:type="spellEnd"/>
-      <w:r>
-        <w:rPr>
-          <w:i/>
-          <w:iCs/>
-          <w:lang w:val="es-MX"/>
-        </w:rPr>
-        <w:t xml:space="preserve"> Token</w:t>
+        <w:t>Refresh Token</w:t>
       </w:r>
       <w:r>
         <w:rPr>
@@ -3475,7 +3435,6 @@
         </w:rPr>
         <w:t xml:space="preserve">la herramienta </w:t>
       </w:r>
-      <w:proofErr w:type="spellStart"/>
       <w:r>
         <w:rPr>
           <w:i/>
@@ -3484,7 +3443,6 @@
         </w:rPr>
         <w:t>AppConfig</w:t>
       </w:r>
-      <w:proofErr w:type="spellEnd"/>
       <w:r>
         <w:rPr>
           <w:lang w:val="es-MX"/>
@@ -3808,23 +3766,13 @@
         </w:rPr>
         <w:t xml:space="preserve"> y el </w:t>
       </w:r>
-      <w:proofErr w:type="spellStart"/>
       <w:r>
         <w:rPr>
           <w:i/>
           <w:iCs/>
           <w:lang w:val="es-MX"/>
         </w:rPr>
-        <w:t>Refresh</w:t>
-      </w:r>
-      <w:proofErr w:type="spellEnd"/>
-      <w:r>
-        <w:rPr>
-          <w:i/>
-          <w:iCs/>
-          <w:lang w:val="es-MX"/>
-        </w:rPr>
-        <w:t xml:space="preserve"> Token</w:t>
+        <w:t>Refresh Token</w:t>
       </w:r>
       <w:r>
         <w:rPr>
@@ -3856,25 +3804,7 @@
           <w:bCs/>
           <w:lang w:val="es-MX"/>
         </w:rPr>
-        <w:t xml:space="preserve">Configuración de </w:t>
-      </w:r>
-      <w:proofErr w:type="spellStart"/>
-      <w:r>
-        <w:rPr>
-          <w:b/>
-          <w:bCs/>
-          <w:lang w:val="es-MX"/>
-        </w:rPr>
-        <w:t>URLs</w:t>
-      </w:r>
-      <w:proofErr w:type="spellEnd"/>
-      <w:r>
-        <w:rPr>
-          <w:b/>
-          <w:bCs/>
-          <w:lang w:val="es-MX"/>
-        </w:rPr>
-        <w:t xml:space="preserve"> de conexión</w:t>
+        <w:t>Configuración de URLs de conexión</w:t>
       </w:r>
       <w:r>
         <w:rPr>
@@ -4219,18 +4149,8 @@
           <w:bCs/>
           <w:lang w:val="es-MX"/>
         </w:rPr>
-        <w:t xml:space="preserve">[ </w:t>
-      </w:r>
-      <w:proofErr w:type="gramStart"/>
-      <w:r>
-        <w:rPr>
-          <w:b/>
-          <w:bCs/>
-          <w:lang w:val="es-MX"/>
-        </w:rPr>
-        <w:t>+ ]</w:t>
-      </w:r>
-      <w:proofErr w:type="gramEnd"/>
+        <w:t>[ + ]</w:t>
+      </w:r>
       <w:r>
         <w:rPr>
           <w:lang w:val="es-MX"/>
@@ -4261,18 +4181,8 @@
           <w:bCs/>
           <w:lang w:val="es-MX"/>
         </w:rPr>
-        <w:t xml:space="preserve">[ </w:t>
-      </w:r>
-      <w:proofErr w:type="gramStart"/>
-      <w:r>
-        <w:rPr>
-          <w:b/>
-          <w:bCs/>
-          <w:lang w:val="es-MX"/>
-        </w:rPr>
-        <w:t>- ]</w:t>
-      </w:r>
-      <w:proofErr w:type="gramEnd"/>
+        <w:t>[ - ]</w:t>
+      </w:r>
       <w:r>
         <w:rPr>
           <w:lang w:val="es-MX"/>
@@ -4303,18 +4213,8 @@
           <w:bCs/>
           <w:lang w:val="es-MX"/>
         </w:rPr>
-        <w:t xml:space="preserve">[ </w:t>
-      </w:r>
-      <w:proofErr w:type="gramStart"/>
-      <w:r>
-        <w:rPr>
-          <w:b/>
-          <w:bCs/>
-          <w:lang w:val="es-MX"/>
-        </w:rPr>
-        <w:t>Editar ]</w:t>
-      </w:r>
-      <w:proofErr w:type="gramEnd"/>
+        <w:t>[ Editar ]</w:t>
+      </w:r>
       <w:r>
         <w:rPr>
           <w:lang w:val="es-MX"/>
@@ -4624,36 +4524,19 @@
         </w:rPr>
         <w:t xml:space="preserve">, el </w:t>
       </w:r>
-      <w:proofErr w:type="spellStart"/>
       <w:r>
         <w:rPr>
           <w:i/>
           <w:iCs/>
           <w:lang w:val="es-MX"/>
         </w:rPr>
-        <w:t>Refresh</w:t>
-      </w:r>
-      <w:proofErr w:type="spellEnd"/>
-      <w:r>
-        <w:rPr>
-          <w:i/>
-          <w:iCs/>
-          <w:lang w:val="es-MX"/>
-        </w:rPr>
-        <w:t xml:space="preserve"> Token</w:t>
-      </w:r>
-      <w:r>
-        <w:rPr>
-          <w:lang w:val="es-MX"/>
-        </w:rPr>
-        <w:t xml:space="preserve"> y la URL de cuentas. Este registro de credenciales mediante autenticación segura garantiza que la aplicación disponga de los permisos necesarios para sincronizar catálogos, consultar información y operar correctamente entre ambas </w:t>
-      </w:r>
-      <w:proofErr w:type="gramStart"/>
-      <w:r>
-        <w:rPr>
-          <w:lang w:val="es-MX"/>
-        </w:rPr>
-        <w:t>plataformas.</w:t>
+        <w:t>Refresh Token</w:t>
+      </w:r>
+      <w:r>
+        <w:rPr>
+          <w:lang w:val="es-MX"/>
+        </w:rPr>
+        <w:t xml:space="preserve"> y la URL de cuentas. Este registro de credenciales mediante autenticación segura garantiza que la aplicación disponga de los permisos necesarios para sincronizar catálogos, consultar información y operar correctamente entre ambas plataformas.</w:t>
       </w:r>
       <w:r>
         <w:rPr>
@@ -4661,7 +4544,6 @@
         </w:rPr>
         <w:t>.</w:t>
       </w:r>
-      <w:proofErr w:type="gramEnd"/>
     </w:p>
     <w:p>
       <w:pPr>
@@ -5160,21 +5042,7 @@
         <w:rPr>
           <w:lang w:val="es-MX"/>
         </w:rPr>
-        <w:t xml:space="preserve"> Especifica la ruta o el </w:t>
-      </w:r>
-      <w:proofErr w:type="spellStart"/>
-      <w:r>
-        <w:rPr>
-          <w:lang w:val="es-MX"/>
-        </w:rPr>
-        <w:t>endpoint</w:t>
-      </w:r>
-      <w:proofErr w:type="spellEnd"/>
-      <w:r>
-        <w:rPr>
-          <w:lang w:val="es-MX"/>
-        </w:rPr>
-        <w:t xml:space="preserve"> web al que se enviarán o solicitarán los datos en Zoho.</w:t>
+        <w:t xml:space="preserve"> Especifica la ruta o el endpoint web al que se enviarán o solicitarán los datos en Zoho.</w:t>
       </w:r>
     </w:p>
     <w:p>
@@ -5216,7 +5084,6 @@
         </w:rPr>
         <w:t>En la sección inferior (</w:t>
       </w:r>
-      <w:proofErr w:type="spellStart"/>
       <w:r>
         <w:rPr>
           <w:b/>
@@ -5225,26 +5092,11 @@
         </w:rPr>
         <w:t>Subnodos</w:t>
       </w:r>
-      <w:proofErr w:type="spellEnd"/>
-      <w:r>
-        <w:rPr>
-          <w:lang w:val="es-MX"/>
-        </w:rPr>
-        <w:t xml:space="preserve">), la interfaz cuenta con una tabla para administrar </w:t>
-      </w:r>
-      <w:proofErr w:type="spellStart"/>
-      <w:r>
-        <w:rPr>
-          <w:lang w:val="es-MX"/>
-        </w:rPr>
-        <w:t>sub-entidades</w:t>
-      </w:r>
-      <w:proofErr w:type="spellEnd"/>
-      <w:r>
-        <w:rPr>
-          <w:lang w:val="es-MX"/>
-        </w:rPr>
-        <w:t xml:space="preserve"> o líneas de detalle (como las partidas de un pedido), acompañada de botones para </w:t>
+      <w:r>
+        <w:rPr>
+          <w:lang w:val="es-MX"/>
+        </w:rPr>
+        <w:t xml:space="preserve">), la interfaz cuenta con una tabla para administrar sub-entidades o líneas de detalle (como las partidas de un pedido), acompañada de botones para </w:t>
       </w:r>
       <w:r>
         <w:rPr>
@@ -5286,21 +5138,7 @@
         <w:rPr>
           <w:lang w:val="es-MX"/>
         </w:rPr>
-        <w:t xml:space="preserve"> dichos </w:t>
-      </w:r>
-      <w:proofErr w:type="spellStart"/>
-      <w:r>
-        <w:rPr>
-          <w:lang w:val="es-MX"/>
-        </w:rPr>
-        <w:t>subnodos</w:t>
-      </w:r>
-      <w:proofErr w:type="spellEnd"/>
-      <w:r>
-        <w:rPr>
-          <w:lang w:val="es-MX"/>
-        </w:rPr>
-        <w:t xml:space="preserve">. Finalmente, en la esquina inferior derecha se encuentran los botones de </w:t>
+        <w:t xml:space="preserve"> dichos subnodos. Finalmente, en la esquina inferior derecha se encuentran los botones de </w:t>
       </w:r>
       <w:r>
         <w:rPr>
@@ -5390,37 +5228,13 @@
           <w:bCs/>
           <w:lang w:val="es-MX"/>
         </w:rPr>
-        <w:t xml:space="preserve">Configuración </w:t>
-      </w:r>
-      <w:proofErr w:type="spellStart"/>
-      <w:r>
-        <w:rPr>
-          <w:b/>
-          <w:bCs/>
-          <w:lang w:val="es-MX"/>
-        </w:rPr>
-        <w:t>subnodos</w:t>
-      </w:r>
-      <w:proofErr w:type="spellEnd"/>
-      <w:r>
-        <w:rPr>
-          <w:lang w:val="es-MX"/>
-        </w:rPr>
-        <w:t xml:space="preserve"> permite administrar y parametrizar las </w:t>
-      </w:r>
-      <w:proofErr w:type="spellStart"/>
-      <w:r>
-        <w:rPr>
-          <w:lang w:val="es-MX"/>
-        </w:rPr>
-        <w:t>sub-entidades</w:t>
-      </w:r>
-      <w:proofErr w:type="spellEnd"/>
-      <w:r>
-        <w:rPr>
-          <w:lang w:val="es-MX"/>
-        </w:rPr>
-        <w:t xml:space="preserve"> o líneas de detalle asociadas a un documento principal (como las partidas de un pedido o factura). Sus campos principales son:</w:t>
+        <w:t>Configuración subnodos</w:t>
+      </w:r>
+      <w:r>
+        <w:rPr>
+          <w:lang w:val="es-MX"/>
+        </w:rPr>
+        <w:t xml:space="preserve"> permite administrar y parametrizar las sub-entidades o líneas de detalle asociadas a un documento principal (como las partidas de un pedido o factura). Sus campos principales son:</w:t>
       </w:r>
     </w:p>
     <w:p>
@@ -5434,7 +5248,6 @@
           <w:lang w:val="es-MX"/>
         </w:rPr>
       </w:pPr>
-      <w:proofErr w:type="spellStart"/>
       <w:r>
         <w:rPr>
           <w:b/>
@@ -5442,16 +5255,7 @@
           <w:lang w:val="es-MX"/>
         </w:rPr>
         <w:lastRenderedPageBreak/>
-        <w:t>Subnodo</w:t>
-      </w:r>
-      <w:proofErr w:type="spellEnd"/>
-      <w:r>
-        <w:rPr>
-          <w:b/>
-          <w:bCs/>
-          <w:lang w:val="es-MX"/>
-        </w:rPr>
-        <w:t>:</w:t>
+        <w:t>Subnodo:</w:t>
       </w:r>
       <w:r>
         <w:rPr>
@@ -5535,21 +5339,7 @@
         <w:rPr>
           <w:lang w:val="es-MX"/>
         </w:rPr>
-        <w:t xml:space="preserve"> Lista las columnas específicas que se extraerán o mapearán para este </w:t>
-      </w:r>
-      <w:proofErr w:type="spellStart"/>
-      <w:r>
-        <w:rPr>
-          <w:lang w:val="es-MX"/>
-        </w:rPr>
-        <w:t>subnodo</w:t>
-      </w:r>
-      <w:proofErr w:type="spellEnd"/>
-      <w:r>
-        <w:rPr>
-          <w:lang w:val="es-MX"/>
-        </w:rPr>
-        <w:t>.</w:t>
+        <w:t xml:space="preserve"> Lista las columnas específicas que se extraerán o mapearán para este subnodo.</w:t>
       </w:r>
     </w:p>
     <w:p>
@@ -5575,21 +5365,7 @@
         <w:rPr>
           <w:lang w:val="es-MX"/>
         </w:rPr>
-        <w:t xml:space="preserve"> Una casilla de verificación para indicar si el </w:t>
-      </w:r>
-      <w:proofErr w:type="spellStart"/>
-      <w:r>
-        <w:rPr>
-          <w:lang w:val="es-MX"/>
-        </w:rPr>
-        <w:t>subnodo</w:t>
-      </w:r>
-      <w:proofErr w:type="spellEnd"/>
-      <w:r>
-        <w:rPr>
-          <w:lang w:val="es-MX"/>
-        </w:rPr>
-        <w:t xml:space="preserve"> corresponde a un objeto individual o único en lugar de una lista múltiple.</w:t>
+        <w:t xml:space="preserve"> Una casilla de verificación para indicar si el subnodo corresponde a un objeto individual o único en lugar de una lista múltiple.</w:t>
       </w:r>
     </w:p>
     <w:p>
@@ -5643,21 +5419,7 @@
         <w:rPr>
           <w:lang w:val="es-MX"/>
         </w:rPr>
-        <w:t xml:space="preserve"> para aplicar la configuración del </w:t>
-      </w:r>
-      <w:proofErr w:type="spellStart"/>
-      <w:r>
-        <w:rPr>
-          <w:lang w:val="es-MX"/>
-        </w:rPr>
-        <w:t>subnodo</w:t>
-      </w:r>
-      <w:proofErr w:type="spellEnd"/>
-      <w:r>
-        <w:rPr>
-          <w:lang w:val="es-MX"/>
-        </w:rPr>
-        <w:t xml:space="preserve"> o </w:t>
+        <w:t xml:space="preserve"> para aplicar la configuración del subnodo o </w:t>
       </w:r>
       <w:r>
         <w:rPr>
@@ -5872,16 +5634,8 @@
         <w:rPr>
           <w:lang w:val="es-MX"/>
         </w:rPr>
-        <w:t xml:space="preserve">completarse con </w:t>
-      </w:r>
-      <w:proofErr w:type="spellStart"/>
-      <w:r>
-        <w:rPr>
-          <w:lang w:val="es-MX"/>
-        </w:rPr>
-        <w:t>exito</w:t>
-      </w:r>
-      <w:proofErr w:type="spellEnd"/>
+        <w:t>completarse con exito</w:t>
+      </w:r>
       <w:r>
         <w:rPr>
           <w:lang w:val="es-MX"/>
@@ -5941,37 +5695,12 @@
           <w:bCs/>
         </w:rPr>
       </w:pPr>
-      <w:proofErr w:type="spellStart"/>
       <w:r>
         <w:rPr>
           <w:b/>
           <w:bCs/>
         </w:rPr>
-        <w:t>Tabla</w:t>
-      </w:r>
-      <w:proofErr w:type="spellEnd"/>
-      <w:r>
-        <w:rPr>
-          <w:b/>
-          <w:bCs/>
-        </w:rPr>
-        <w:t xml:space="preserve"> de </w:t>
-      </w:r>
-      <w:proofErr w:type="spellStart"/>
-      <w:r>
-        <w:rPr>
-          <w:b/>
-          <w:bCs/>
-        </w:rPr>
-        <w:t>Usuario</w:t>
-      </w:r>
-      <w:proofErr w:type="spellEnd"/>
-      <w:r>
-        <w:rPr>
-          <w:b/>
-          <w:bCs/>
-        </w:rPr>
-        <w:t xml:space="preserve"> (UDT)</w:t>
+        <w:t>Tabla de Usuario (UDT)</w:t>
       </w:r>
     </w:p>
     <w:tbl>
@@ -5996,21 +5725,12 @@
             <w:pPr>
               <w:jc w:val="both"/>
             </w:pPr>
-            <w:proofErr w:type="spellStart"/>
             <w:r>
               <w:rPr>
                 <w:rStyle w:val="Fuerte"/>
                 <w:rFonts w:ascii="Arial" w:hAnsi="Arial" w:cs="Arial"/>
               </w:rPr>
-              <w:t>Tabla</w:t>
-            </w:r>
-            <w:proofErr w:type="spellEnd"/>
-            <w:r>
-              <w:rPr>
-                <w:rStyle w:val="Fuerte"/>
-                <w:rFonts w:ascii="Arial" w:hAnsi="Arial" w:cs="Arial"/>
-              </w:rPr>
-              <w:t xml:space="preserve"> SAP</w:t>
+              <w:t>Tabla SAP</w:t>
             </w:r>
           </w:p>
         </w:tc>
@@ -6023,7 +5743,6 @@
             <w:pPr>
               <w:jc w:val="both"/>
             </w:pPr>
-            <w:proofErr w:type="spellStart"/>
             <w:r>
               <w:rPr>
                 <w:rStyle w:val="Fuerte"/>
@@ -6031,7 +5750,6 @@
               </w:rPr>
               <w:t>Descripción</w:t>
             </w:r>
-            <w:proofErr w:type="spellEnd"/>
           </w:p>
         </w:tc>
         <w:tc>
@@ -6110,27 +5828,7 @@
                 <w:szCs w:val="20"/>
                 <w:lang w:val="es-MX"/>
               </w:rPr>
-              <w:t xml:space="preserve">Zoho </w:t>
-            </w:r>
-            <w:proofErr w:type="spellStart"/>
-            <w:r>
-              <w:rPr>
-                <w:rFonts w:cs="Arial"/>
-                <w:sz w:val="20"/>
-                <w:szCs w:val="20"/>
-                <w:lang w:val="es-MX"/>
-              </w:rPr>
-              <w:t>Sync</w:t>
-            </w:r>
-            <w:proofErr w:type="spellEnd"/>
-            <w:r>
-              <w:rPr>
-                <w:rFonts w:cs="Arial"/>
-                <w:sz w:val="20"/>
-                <w:szCs w:val="20"/>
-                <w:lang w:val="es-MX"/>
-              </w:rPr>
-              <w:t xml:space="preserve"> Log</w:t>
+              <w:t>Zoho Sync Log</w:t>
             </w:r>
           </w:p>
         </w:tc>
@@ -6149,7 +5847,6 @@
                 <w:lang w:val="es-MX"/>
               </w:rPr>
             </w:pPr>
-            <w:proofErr w:type="spellStart"/>
             <w:r>
               <w:rPr>
                 <w:rFonts w:cs="Arial"/>
@@ -6159,7 +5856,6 @@
               </w:rPr>
               <w:t>NoObject</w:t>
             </w:r>
-            <w:proofErr w:type="spellEnd"/>
           </w:p>
         </w:tc>
       </w:tr>
@@ -6264,35 +5960,7 @@
                 <w:bdr w:val="none" w:sz="0" w:space="0" w:color="auto" w:frame="1"/>
                 <w:lang w:val="es-MX" w:eastAsia="es-MX"/>
               </w:rPr>
-              <w:t>Campo (</w:t>
-            </w:r>
-            <w:proofErr w:type="spellStart"/>
-            <w:r>
-              <w:rPr>
-                <w:rFonts w:ascii="Arial" w:eastAsia="Times New Roman" w:hAnsi="Arial" w:cs="Arial"/>
-                <w:b/>
-                <w:bCs/>
-                <w:color w:val="1F1F1F"/>
-                <w:sz w:val="24"/>
-                <w:szCs w:val="24"/>
-                <w:bdr w:val="none" w:sz="0" w:space="0" w:color="auto" w:frame="1"/>
-                <w:lang w:val="es-MX" w:eastAsia="es-MX"/>
-              </w:rPr>
-              <w:t>FieldName</w:t>
-            </w:r>
-            <w:proofErr w:type="spellEnd"/>
-            <w:r>
-              <w:rPr>
-                <w:rFonts w:ascii="Arial" w:eastAsia="Times New Roman" w:hAnsi="Arial" w:cs="Arial"/>
-                <w:b/>
-                <w:bCs/>
-                <w:color w:val="1F1F1F"/>
-                <w:sz w:val="24"/>
-                <w:szCs w:val="24"/>
-                <w:bdr w:val="none" w:sz="0" w:space="0" w:color="auto" w:frame="1"/>
-                <w:lang w:val="es-MX" w:eastAsia="es-MX"/>
-              </w:rPr>
-              <w:t>)</w:t>
+              <w:t>Campo (FieldName)</w:t>
             </w:r>
           </w:p>
         </w:tc>
@@ -6451,31 +6119,7 @@
                 <w:bdr w:val="none" w:sz="0" w:space="0" w:color="auto" w:frame="1"/>
                 <w:lang w:val="es-MX" w:eastAsia="es-MX"/>
               </w:rPr>
-              <w:t xml:space="preserve">Zoho </w:t>
-            </w:r>
-            <w:proofErr w:type="spellStart"/>
-            <w:r>
-              <w:rPr>
-                <w:rFonts w:ascii="Arial" w:eastAsia="Times New Roman" w:hAnsi="Arial" w:cs="Arial"/>
-                <w:color w:val="1F1F1F"/>
-                <w:sz w:val="24"/>
-                <w:szCs w:val="24"/>
-                <w:bdr w:val="none" w:sz="0" w:space="0" w:color="auto" w:frame="1"/>
-                <w:lang w:val="es-MX" w:eastAsia="es-MX"/>
-              </w:rPr>
-              <w:t>Sync</w:t>
-            </w:r>
-            <w:proofErr w:type="spellEnd"/>
-            <w:r>
-              <w:rPr>
-                <w:rFonts w:ascii="Arial" w:eastAsia="Times New Roman" w:hAnsi="Arial" w:cs="Arial"/>
-                <w:color w:val="1F1F1F"/>
-                <w:sz w:val="24"/>
-                <w:szCs w:val="24"/>
-                <w:bdr w:val="none" w:sz="0" w:space="0" w:color="auto" w:frame="1"/>
-                <w:lang w:val="es-MX" w:eastAsia="es-MX"/>
-              </w:rPr>
-              <w:t xml:space="preserve"> Log</w:t>
+              <w:t>Zoho Sync Log</w:t>
             </w:r>
             <w:r>
               <w:rPr>
@@ -6575,7 +6219,6 @@
                 <w:lang w:val="es-MX" w:eastAsia="es-MX"/>
               </w:rPr>
             </w:pPr>
-            <w:proofErr w:type="spellStart"/>
             <w:r>
               <w:rPr>
                 <w:rFonts w:ascii="Arial" w:eastAsia="Times New Roman" w:hAnsi="Arial" w:cs="Arial"/>
@@ -6587,7 +6230,6 @@
               </w:rPr>
               <w:t>LastSync</w:t>
             </w:r>
-            <w:proofErr w:type="spellEnd"/>
           </w:p>
         </w:tc>
         <w:tc>
@@ -6614,21 +6256,8 @@
                 <w:bdr w:val="none" w:sz="0" w:space="0" w:color="auto" w:frame="1"/>
                 <w:lang w:val="es-MX" w:eastAsia="es-MX"/>
               </w:rPr>
-              <w:t xml:space="preserve">Ultima Fecha </w:t>
-            </w:r>
-            <w:proofErr w:type="spellStart"/>
-            <w:r>
-              <w:rPr>
-                <w:rFonts w:ascii="Arial" w:eastAsia="Times New Roman" w:hAnsi="Arial" w:cs="Arial"/>
-                <w:color w:val="1F1F1F"/>
-                <w:sz w:val="24"/>
-                <w:szCs w:val="24"/>
-                <w:bdr w:val="none" w:sz="0" w:space="0" w:color="auto" w:frame="1"/>
-                <w:lang w:val="es-MX" w:eastAsia="es-MX"/>
-              </w:rPr>
-              <w:t>Sincronizacion</w:t>
-            </w:r>
-            <w:proofErr w:type="spellEnd"/>
+              <w:t>Ultima Fecha Sincronizacion</w:t>
+            </w:r>
             <w:r>
               <w:rPr>
                 <w:rFonts w:ascii="Arial" w:eastAsia="Times New Roman" w:hAnsi="Arial" w:cs="Arial"/>
@@ -6678,7 +6307,6 @@
               </w:rPr>
               <w:t>Tipo: Fecha (</w:t>
             </w:r>
-            <w:proofErr w:type="spellStart"/>
             <w:r>
               <w:rPr>
                 <w:rFonts w:ascii="Arial" w:eastAsia="Times New Roman" w:hAnsi="Arial" w:cs="Arial"/>
@@ -6690,7 +6318,6 @@
               </w:rPr>
               <w:t>db_Date</w:t>
             </w:r>
-            <w:proofErr w:type="spellEnd"/>
             <w:r>
               <w:rPr>
                 <w:rFonts w:ascii="Arial" w:eastAsia="Times New Roman" w:hAnsi="Arial" w:cs="Arial"/>
@@ -6772,7 +6399,6 @@
                 <w:lang w:val="es-MX" w:eastAsia="es-MX"/>
               </w:rPr>
             </w:pPr>
-            <w:proofErr w:type="spellStart"/>
             <w:r>
               <w:rPr>
                 <w:rFonts w:ascii="Arial" w:eastAsia="Times New Roman" w:hAnsi="Arial" w:cs="Arial"/>
@@ -6784,7 +6410,6 @@
               </w:rPr>
               <w:t>LastTime</w:t>
             </w:r>
-            <w:proofErr w:type="spellEnd"/>
           </w:p>
         </w:tc>
         <w:tc>
@@ -6811,21 +6436,8 @@
                 <w:bdr w:val="none" w:sz="0" w:space="0" w:color="auto" w:frame="1"/>
                 <w:lang w:val="es-MX" w:eastAsia="es-MX"/>
               </w:rPr>
-              <w:t xml:space="preserve">Ultima Hora </w:t>
-            </w:r>
-            <w:proofErr w:type="spellStart"/>
-            <w:r>
-              <w:rPr>
-                <w:rFonts w:ascii="Arial" w:eastAsia="Times New Roman" w:hAnsi="Arial" w:cs="Arial"/>
-                <w:color w:val="1F1F1F"/>
-                <w:sz w:val="24"/>
-                <w:szCs w:val="24"/>
-                <w:bdr w:val="none" w:sz="0" w:space="0" w:color="auto" w:frame="1"/>
-                <w:lang w:val="es-MX" w:eastAsia="es-MX"/>
-              </w:rPr>
-              <w:t>Sincronizacion</w:t>
-            </w:r>
-            <w:proofErr w:type="spellEnd"/>
+              <w:t>Ultima Hora Sincronizacion</w:t>
+            </w:r>
             <w:r>
               <w:rPr>
                 <w:rFonts w:ascii="Arial" w:eastAsia="Times New Roman" w:hAnsi="Arial" w:cs="Arial"/>
@@ -6875,7 +6487,6 @@
               </w:rPr>
               <w:t>Tipo: Fecha, Subtipo: Hora (</w:t>
             </w:r>
-            <w:proofErr w:type="spellStart"/>
             <w:r>
               <w:rPr>
                 <w:rFonts w:ascii="Arial" w:eastAsia="Times New Roman" w:hAnsi="Arial" w:cs="Arial"/>
@@ -6887,7 +6498,6 @@
               </w:rPr>
               <w:t>st_Time</w:t>
             </w:r>
-            <w:proofErr w:type="spellEnd"/>
             <w:r>
               <w:rPr>
                 <w:rFonts w:ascii="Arial" w:eastAsia="Times New Roman" w:hAnsi="Arial" w:cs="Arial"/>
@@ -6980,7 +6590,6 @@
                 <w:lang w:val="es-MX" w:eastAsia="es-MX"/>
               </w:rPr>
             </w:pPr>
-            <w:proofErr w:type="spellStart"/>
             <w:r>
               <w:rPr>
                 <w:rFonts w:ascii="Arial" w:eastAsia="Times New Roman" w:hAnsi="Arial" w:cs="Arial"/>
@@ -6992,7 +6601,6 @@
               </w:rPr>
               <w:t>AVS_ZohoAccId</w:t>
             </w:r>
-            <w:proofErr w:type="spellEnd"/>
           </w:p>
         </w:tc>
         <w:tc>
@@ -7151,7 +6759,6 @@
                 <w:lang w:val="es-MX" w:eastAsia="es-MX"/>
               </w:rPr>
             </w:pPr>
-            <w:proofErr w:type="spellStart"/>
             <w:r>
               <w:rPr>
                 <w:rFonts w:ascii="Arial" w:eastAsia="Times New Roman" w:hAnsi="Arial" w:cs="Arial"/>
@@ -7163,7 +6770,6 @@
               </w:rPr>
               <w:t>AVS_ZohoCntId</w:t>
             </w:r>
-            <w:proofErr w:type="spellEnd"/>
           </w:p>
         </w:tc>
         <w:tc>
@@ -7181,7 +6787,6 @@
                 <w:lang w:val="es-MX" w:eastAsia="es-MX"/>
               </w:rPr>
             </w:pPr>
-            <w:proofErr w:type="gramStart"/>
             <w:r>
               <w:rPr>
                 <w:rFonts w:ascii="Arial" w:eastAsia="Times New Roman" w:hAnsi="Arial" w:cs="Arial"/>
@@ -7191,19 +6796,7 @@
                 <w:bdr w:val="none" w:sz="0" w:space="0" w:color="auto" w:frame="1"/>
                 <w:lang w:val="es-MX" w:eastAsia="es-MX"/>
               </w:rPr>
-              <w:t>Id</w:t>
-            </w:r>
-            <w:proofErr w:type="gramEnd"/>
-            <w:r>
-              <w:rPr>
-                <w:rFonts w:ascii="Arial" w:eastAsia="Times New Roman" w:hAnsi="Arial" w:cs="Arial"/>
-                <w:color w:val="1F1F1F"/>
-                <w:sz w:val="24"/>
-                <w:szCs w:val="24"/>
-                <w:bdr w:val="none" w:sz="0" w:space="0" w:color="auto" w:frame="1"/>
-                <w:lang w:val="es-MX" w:eastAsia="es-MX"/>
-              </w:rPr>
-              <w:t xml:space="preserve"> Contacto Zoho CRM</w:t>
+              <w:t>Id Contacto Zoho CRM</w:t>
             </w:r>
             <w:r>
               <w:rPr>
@@ -7335,7 +6928,6 @@
                 <w:lang w:val="es-MX" w:eastAsia="es-MX"/>
               </w:rPr>
             </w:pPr>
-            <w:proofErr w:type="spellStart"/>
             <w:r>
               <w:rPr>
                 <w:rFonts w:ascii="Arial" w:eastAsia="Times New Roman" w:hAnsi="Arial" w:cs="Arial"/>
@@ -7347,7 +6939,6 @@
               </w:rPr>
               <w:t>AVS_ID_Zoho</w:t>
             </w:r>
-            <w:proofErr w:type="spellEnd"/>
           </w:p>
         </w:tc>
         <w:tc>
@@ -7365,7 +6956,6 @@
                 <w:lang w:val="es-MX" w:eastAsia="es-MX"/>
               </w:rPr>
             </w:pPr>
-            <w:proofErr w:type="gramStart"/>
             <w:r>
               <w:rPr>
                 <w:rFonts w:ascii="Arial" w:eastAsia="Times New Roman" w:hAnsi="Arial" w:cs="Arial"/>
@@ -7375,19 +6965,7 @@
                 <w:bdr w:val="none" w:sz="0" w:space="0" w:color="auto" w:frame="1"/>
                 <w:lang w:val="es-MX" w:eastAsia="es-MX"/>
               </w:rPr>
-              <w:t>ID</w:t>
-            </w:r>
-            <w:proofErr w:type="gramEnd"/>
-            <w:r>
-              <w:rPr>
-                <w:rFonts w:ascii="Arial" w:eastAsia="Times New Roman" w:hAnsi="Arial" w:cs="Arial"/>
-                <w:color w:val="1F1F1F"/>
-                <w:sz w:val="24"/>
-                <w:szCs w:val="24"/>
-                <w:bdr w:val="none" w:sz="0" w:space="0" w:color="auto" w:frame="1"/>
-                <w:lang w:val="es-MX" w:eastAsia="es-MX"/>
-              </w:rPr>
-              <w:t xml:space="preserve"> Zoho</w:t>
+              <w:t>ID Zoho</w:t>
             </w:r>
             <w:r>
               <w:rPr>
@@ -7519,7 +7097,6 @@
                 <w:lang w:val="es-MX" w:eastAsia="es-MX"/>
               </w:rPr>
             </w:pPr>
-            <w:proofErr w:type="spellStart"/>
             <w:r>
               <w:rPr>
                 <w:rFonts w:ascii="Arial" w:eastAsia="Times New Roman" w:hAnsi="Arial" w:cs="Arial"/>
@@ -7531,7 +7108,6 @@
               </w:rPr>
               <w:t>AVS_Zoho_Sync</w:t>
             </w:r>
-            <w:proofErr w:type="spellEnd"/>
           </w:p>
         </w:tc>
         <w:tc>
@@ -7732,7 +7308,6 @@
                 <w:lang w:val="es-MX" w:eastAsia="es-MX"/>
               </w:rPr>
             </w:pPr>
-            <w:proofErr w:type="spellStart"/>
             <w:r>
               <w:rPr>
                 <w:rFonts w:ascii="Arial" w:eastAsia="Times New Roman" w:hAnsi="Arial" w:cs="Arial"/>
@@ -7744,7 +7319,6 @@
               </w:rPr>
               <w:t>AVS_Zoho_ProcResult</w:t>
             </w:r>
-            <w:proofErr w:type="spellEnd"/>
           </w:p>
         </w:tc>
         <w:tc>
@@ -7938,7 +7512,6 @@
                 <w:lang w:val="es-MX" w:eastAsia="es-MX"/>
               </w:rPr>
             </w:pPr>
-            <w:proofErr w:type="spellStart"/>
             <w:r>
               <w:rPr>
                 <w:rFonts w:ascii="Arial" w:eastAsia="Times New Roman" w:hAnsi="Arial" w:cs="Arial"/>
@@ -7950,7 +7523,6 @@
               </w:rPr>
               <w:t>AVS_IVA_Zoho</w:t>
             </w:r>
-            <w:proofErr w:type="spellEnd"/>
           </w:p>
         </w:tc>
         <w:tc>
@@ -8070,7 +7642,6 @@
               </w:rPr>
               <w:t xml:space="preserve"> = </w:t>
             </w:r>
-            <w:proofErr w:type="spellStart"/>
             <w:r>
               <w:rPr>
                 <w:rFonts w:ascii="Arial" w:eastAsia="Times New Roman" w:hAnsi="Arial" w:cs="Arial"/>
@@ -8081,7 +7652,6 @@
               </w:rPr>
               <w:t>Excento</w:t>
             </w:r>
-            <w:proofErr w:type="spellEnd"/>
             <w:r>
               <w:rPr>
                 <w:rFonts w:ascii="Arial" w:eastAsia="Times New Roman" w:hAnsi="Arial" w:cs="Arial"/>
@@ -8183,7 +7753,6 @@
                 <w:lang w:val="es-MX" w:eastAsia="es-MX"/>
               </w:rPr>
             </w:pPr>
-            <w:proofErr w:type="spellStart"/>
             <w:r>
               <w:rPr>
                 <w:rFonts w:ascii="Arial" w:eastAsia="Times New Roman" w:hAnsi="Arial" w:cs="Arial"/>
@@ -8195,7 +7764,6 @@
               </w:rPr>
               <w:t>AVS_ZohoID</w:t>
             </w:r>
-            <w:proofErr w:type="spellEnd"/>
           </w:p>
         </w:tc>
         <w:tc>
@@ -8222,21 +7790,8 @@
                 <w:bdr w:val="none" w:sz="0" w:space="0" w:color="auto" w:frame="1"/>
                 <w:lang w:val="es-MX" w:eastAsia="es-MX"/>
               </w:rPr>
-              <w:t xml:space="preserve">Zoho ID </w:t>
-            </w:r>
-            <w:proofErr w:type="spellStart"/>
-            <w:r>
-              <w:rPr>
-                <w:rFonts w:ascii="Arial" w:eastAsia="Times New Roman" w:hAnsi="Arial" w:cs="Arial"/>
-                <w:color w:val="1F1F1F"/>
-                <w:sz w:val="24"/>
-                <w:szCs w:val="24"/>
-                <w:bdr w:val="none" w:sz="0" w:space="0" w:color="auto" w:frame="1"/>
-                <w:lang w:val="es-MX" w:eastAsia="es-MX"/>
-              </w:rPr>
-              <w:t>Product</w:t>
-            </w:r>
-            <w:proofErr w:type="spellEnd"/>
+              <w:t>Zoho ID Product</w:t>
+            </w:r>
             <w:r>
               <w:rPr>
                 <w:rFonts w:ascii="Arial" w:eastAsia="Times New Roman" w:hAnsi="Arial" w:cs="Arial"/>
@@ -8368,7 +7923,6 @@
                 <w:lang w:val="es-MX" w:eastAsia="es-MX"/>
               </w:rPr>
             </w:pPr>
-            <w:proofErr w:type="spellStart"/>
             <w:r>
               <w:rPr>
                 <w:rFonts w:ascii="Arial" w:eastAsia="Times New Roman" w:hAnsi="Arial" w:cs="Arial"/>
@@ -8380,7 +7934,6 @@
               </w:rPr>
               <w:t>AVS_Zoho_Sync</w:t>
             </w:r>
-            <w:proofErr w:type="spellEnd"/>
           </w:p>
         </w:tc>
         <w:tc>
@@ -8581,7 +8134,6 @@
                 <w:lang w:val="es-MX" w:eastAsia="es-MX"/>
               </w:rPr>
             </w:pPr>
-            <w:proofErr w:type="spellStart"/>
             <w:r>
               <w:rPr>
                 <w:rFonts w:ascii="Arial" w:eastAsia="Times New Roman" w:hAnsi="Arial" w:cs="Arial"/>
@@ -8593,7 +8145,6 @@
               </w:rPr>
               <w:t>AVS_Zoho_ProcResult</w:t>
             </w:r>
-            <w:proofErr w:type="spellEnd"/>
           </w:p>
         </w:tc>
         <w:tc>
@@ -8752,7 +8303,6 @@
                 <w:lang w:val="es-MX" w:eastAsia="es-MX"/>
               </w:rPr>
             </w:pPr>
-            <w:proofErr w:type="spellStart"/>
             <w:r>
               <w:rPr>
                 <w:rFonts w:ascii="Arial" w:eastAsia="Times New Roman" w:hAnsi="Arial" w:cs="Arial"/>
@@ -8764,7 +8314,6 @@
               </w:rPr>
               <w:t>AVS_ZohoDealId</w:t>
             </w:r>
-            <w:proofErr w:type="spellEnd"/>
           </w:p>
         </w:tc>
         <w:tc>
@@ -8923,7 +8472,6 @@
                 <w:lang w:val="es-MX" w:eastAsia="es-MX"/>
               </w:rPr>
             </w:pPr>
-            <w:proofErr w:type="spellStart"/>
             <w:r>
               <w:rPr>
                 <w:rFonts w:ascii="Arial" w:eastAsia="Times New Roman" w:hAnsi="Arial" w:cs="Arial"/>
@@ -8935,7 +8483,6 @@
               </w:rPr>
               <w:t>AVS_Cotizacion_Zoho</w:t>
             </w:r>
-            <w:proofErr w:type="spellEnd"/>
           </w:p>
         </w:tc>
         <w:tc>
@@ -9094,7 +8641,6 @@
                 <w:lang w:val="es-MX" w:eastAsia="es-MX"/>
               </w:rPr>
             </w:pPr>
-            <w:proofErr w:type="spellStart"/>
             <w:r>
               <w:rPr>
                 <w:rFonts w:ascii="Arial" w:eastAsia="Times New Roman" w:hAnsi="Arial" w:cs="Arial"/>
@@ -9106,7 +8652,6 @@
               </w:rPr>
               <w:t>AVS_FormaPago_Zoho</w:t>
             </w:r>
-            <w:proofErr w:type="spellEnd"/>
           </w:p>
         </w:tc>
         <w:tc>
@@ -9265,7 +8810,6 @@
                 <w:lang w:val="es-MX" w:eastAsia="es-MX"/>
               </w:rPr>
             </w:pPr>
-            <w:proofErr w:type="spellStart"/>
             <w:r>
               <w:rPr>
                 <w:rFonts w:ascii="Arial" w:eastAsia="Times New Roman" w:hAnsi="Arial" w:cs="Arial"/>
@@ -9277,7 +8821,6 @@
               </w:rPr>
               <w:t>AVS_ZohoID_DocSAP</w:t>
             </w:r>
-            <w:proofErr w:type="spellEnd"/>
           </w:p>
         </w:tc>
         <w:tc>
@@ -9304,21 +8847,8 @@
                 <w:bdr w:val="none" w:sz="0" w:space="0" w:color="auto" w:frame="1"/>
                 <w:lang w:val="es-MX" w:eastAsia="es-MX"/>
               </w:rPr>
-              <w:t xml:space="preserve">Zoho Id </w:t>
-            </w:r>
-            <w:proofErr w:type="spellStart"/>
-            <w:r>
-              <w:rPr>
-                <w:rFonts w:ascii="Arial" w:eastAsia="Times New Roman" w:hAnsi="Arial" w:cs="Arial"/>
-                <w:color w:val="1F1F1F"/>
-                <w:sz w:val="24"/>
-                <w:szCs w:val="24"/>
-                <w:bdr w:val="none" w:sz="0" w:space="0" w:color="auto" w:frame="1"/>
-                <w:lang w:val="es-MX" w:eastAsia="es-MX"/>
-              </w:rPr>
-              <w:t>DocSAP</w:t>
-            </w:r>
-            <w:proofErr w:type="spellEnd"/>
+              <w:t>Zoho Id DocSAP</w:t>
+            </w:r>
             <w:r>
               <w:rPr>
                 <w:rFonts w:ascii="Arial" w:eastAsia="Times New Roman" w:hAnsi="Arial" w:cs="Arial"/>
@@ -9449,7 +8979,6 @@
                 <w:lang w:val="es-MX" w:eastAsia="es-MX"/>
               </w:rPr>
             </w:pPr>
-            <w:proofErr w:type="spellStart"/>
             <w:r>
               <w:rPr>
                 <w:rFonts w:ascii="Arial" w:eastAsia="Times New Roman" w:hAnsi="Arial" w:cs="Arial"/>
@@ -9461,7 +8990,6 @@
               </w:rPr>
               <w:t>AVS_Zoho_Sync</w:t>
             </w:r>
-            <w:proofErr w:type="spellEnd"/>
           </w:p>
         </w:tc>
         <w:tc>
@@ -9662,7 +9190,6 @@
                 <w:lang w:val="es-MX" w:eastAsia="es-MX"/>
               </w:rPr>
             </w:pPr>
-            <w:proofErr w:type="spellStart"/>
             <w:r>
               <w:rPr>
                 <w:rFonts w:ascii="Arial" w:eastAsia="Times New Roman" w:hAnsi="Arial" w:cs="Arial"/>
@@ -9674,7 +9201,6 @@
               </w:rPr>
               <w:t>AVS_Zoho_ProcResult</w:t>
             </w:r>
-            <w:proofErr w:type="spellEnd"/>
           </w:p>
         </w:tc>
         <w:tc>
@@ -9833,7 +9359,6 @@
                 <w:lang w:val="es-MX" w:eastAsia="es-MX"/>
               </w:rPr>
             </w:pPr>
-            <w:proofErr w:type="spellStart"/>
             <w:r>
               <w:rPr>
                 <w:rFonts w:ascii="Arial" w:eastAsia="Times New Roman" w:hAnsi="Arial" w:cs="Arial"/>
@@ -9845,7 +9370,6 @@
               </w:rPr>
               <w:t>AVS_ZohoID_DocSAP</w:t>
             </w:r>
-            <w:proofErr w:type="spellEnd"/>
           </w:p>
         </w:tc>
         <w:tc>
@@ -9872,21 +9396,8 @@
                 <w:bdr w:val="none" w:sz="0" w:space="0" w:color="auto" w:frame="1"/>
                 <w:lang w:val="es-MX" w:eastAsia="es-MX"/>
               </w:rPr>
-              <w:t xml:space="preserve">Zoho Id </w:t>
-            </w:r>
-            <w:proofErr w:type="spellStart"/>
-            <w:r>
-              <w:rPr>
-                <w:rFonts w:ascii="Arial" w:eastAsia="Times New Roman" w:hAnsi="Arial" w:cs="Arial"/>
-                <w:color w:val="1F1F1F"/>
-                <w:sz w:val="24"/>
-                <w:szCs w:val="24"/>
-                <w:bdr w:val="none" w:sz="0" w:space="0" w:color="auto" w:frame="1"/>
-                <w:lang w:val="es-MX" w:eastAsia="es-MX"/>
-              </w:rPr>
-              <w:t>DocSAP</w:t>
-            </w:r>
-            <w:proofErr w:type="spellEnd"/>
+              <w:t>Zoho Id DocSAP</w:t>
+            </w:r>
             <w:r>
               <w:rPr>
                 <w:rFonts w:ascii="Arial" w:eastAsia="Times New Roman" w:hAnsi="Arial" w:cs="Arial"/>
@@ -10158,7 +9669,6 @@
         </w:rPr>
         <w:t xml:space="preserve"> Consulta únicamente los cambios realizados a partir de la última fecha de sincronización, formatea y traduce los valores (textos, precios, fechas y nulos) para hacerlos compatibles, genera un paquete de datos estructurado en formato JSON y realiza una petición digital de tipo </w:t>
       </w:r>
-      <w:proofErr w:type="spellStart"/>
       <w:r>
         <w:rPr>
           <w:i/>
@@ -10167,7 +9677,6 @@
         </w:rPr>
         <w:t>Upsert</w:t>
       </w:r>
-      <w:proofErr w:type="spellEnd"/>
       <w:r>
         <w:rPr>
           <w:lang w:val="es-MX"/>
@@ -10240,21 +9749,7 @@
         <w:rPr>
           <w:lang w:val="es-MX"/>
         </w:rPr>
-        <w:t xml:space="preserve">la </w:t>
-      </w:r>
-      <w:proofErr w:type="spellStart"/>
-      <w:r>
-        <w:rPr>
-          <w:lang w:val="es-MX"/>
-        </w:rPr>
-        <w:t>subfroma</w:t>
-      </w:r>
-      <w:proofErr w:type="spellEnd"/>
-      <w:r>
-        <w:rPr>
-          <w:lang w:val="es-MX"/>
-        </w:rPr>
-        <w:t xml:space="preserve"> de </w:t>
+        <w:t xml:space="preserve">la subfroma de </w:t>
       </w:r>
       <w:r>
         <w:rPr>
@@ -10300,7 +9795,6 @@
         </w:rPr>
         <w:t xml:space="preserve"> Lee la información de la cabecera, recorre las líneas o partidas de detalle, verifica de forma inteligente si existen archivos PDF adjuntos en el equipo para subirlos temporalmente a la nube de Zoho y enlazarlos mediante un identificador único (</w:t>
       </w:r>
-      <w:proofErr w:type="spellStart"/>
       <w:r>
         <w:rPr>
           <w:i/>
@@ -10309,7 +9803,6 @@
         </w:rPr>
         <w:t>file_id</w:t>
       </w:r>
-      <w:proofErr w:type="spellEnd"/>
       <w:r>
         <w:rPr>
           <w:lang w:val="es-MX"/>
@@ -10567,7 +10060,7 @@
       <w:tr>
         <w:tc>
           <w:tcPr>
-            <w:tcW w:w="4713" w:type="dxa"/>
+            <w:tcW w:w="5144" w:type="dxa"/>
           </w:tcPr>
           <w:p>
             <w:pPr>
@@ -10586,7 +10079,7 @@
         </w:tc>
         <w:tc>
           <w:tcPr>
-            <w:tcW w:w="4071" w:type="dxa"/>
+            <w:tcW w:w="3640" w:type="dxa"/>
           </w:tcPr>
           <w:p>
             <w:pPr>
@@ -10595,13 +10088,8 @@
                 <w:lang w:val="es-MX"/>
               </w:rPr>
             </w:pPr>
-            <w:proofErr w:type="spellStart"/>
-            <w:r>
-              <w:t>Tabla</w:t>
-            </w:r>
-            <w:proofErr w:type="spellEnd"/>
-            <w:r>
-              <w:t xml:space="preserve"> SAP</w:t>
+            <w:r>
+              <w:t>Tabla SAP</w:t>
             </w:r>
           </w:p>
         </w:tc>
@@ -10609,7 +10097,7 @@
       <w:tr>
         <w:tc>
           <w:tcPr>
-            <w:tcW w:w="4713" w:type="dxa"/>
+            <w:tcW w:w="5144" w:type="dxa"/>
           </w:tcPr>
           <w:p>
             <w:pPr>
@@ -10625,7 +10113,7 @@
         </w:tc>
         <w:tc>
           <w:tcPr>
-            <w:tcW w:w="4071" w:type="dxa"/>
+            <w:tcW w:w="3640" w:type="dxa"/>
           </w:tcPr>
           <w:p>
             <w:pPr>
@@ -10634,13 +10122,8 @@
                 <w:lang w:val="es-MX"/>
               </w:rPr>
             </w:pPr>
-            <w:proofErr w:type="spellStart"/>
-            <w:r>
-              <w:t>Estructura</w:t>
-            </w:r>
-            <w:proofErr w:type="spellEnd"/>
-            <w:r>
-              <w:t xml:space="preserve"> de BD</w:t>
+            <w:r>
+              <w:t>Estructura de BD</w:t>
             </w:r>
           </w:p>
         </w:tc>
@@ -10648,7 +10131,7 @@
       <w:tr>
         <w:tc>
           <w:tcPr>
-            <w:tcW w:w="4713" w:type="dxa"/>
+            <w:tcW w:w="5144" w:type="dxa"/>
           </w:tcPr>
           <w:p>
             <w:pPr>
@@ -10664,7 +10147,7 @@
         </w:tc>
         <w:tc>
           <w:tcPr>
-            <w:tcW w:w="4071" w:type="dxa"/>
+            <w:tcW w:w="3640" w:type="dxa"/>
           </w:tcPr>
           <w:p>
             <w:pPr>
@@ -10674,15 +10157,7 @@
               </w:rPr>
             </w:pPr>
             <w:r>
-              <w:t>OITM (</w:t>
-            </w:r>
-            <w:proofErr w:type="spellStart"/>
-            <w:r>
-              <w:t>Artículos</w:t>
-            </w:r>
-            <w:proofErr w:type="spellEnd"/>
-            <w:r>
-              <w:t>)</w:t>
+              <w:t>OITM (Artículos)</w:t>
             </w:r>
           </w:p>
         </w:tc>
@@ -10690,41 +10165,39 @@
       <w:tr>
         <w:tc>
           <w:tcPr>
-            <w:tcW w:w="4713" w:type="dxa"/>
+            <w:tcW w:w="5144" w:type="dxa"/>
           </w:tcPr>
           <w:p>
             <w:pPr>
               <w:jc w:val="both"/>
+            </w:pPr>
+            <w:r>
               <w:rPr>
                 <w:lang w:val="es-MX"/>
               </w:rPr>
-            </w:pPr>
-            <w:r>
-              <w:t>SENDPURCHASES_DOCUMENTOSSAP</w:t>
+              <w:t>SENDQUOTATIONS_DOCUMENTOSSAP</w:t>
             </w:r>
           </w:p>
         </w:tc>
         <w:tc>
           <w:tcPr>
-            <w:tcW w:w="4071" w:type="dxa"/>
+            <w:tcW w:w="3640" w:type="dxa"/>
           </w:tcPr>
           <w:p>
             <w:pPr>
               <w:jc w:val="both"/>
+            </w:pPr>
+            <w:r>
               <w:rPr>
                 <w:lang w:val="es-MX"/>
               </w:rPr>
-            </w:pPr>
-            <w:r>
-              <w:t>ORDR (</w:t>
-            </w:r>
-            <w:proofErr w:type="spellStart"/>
-            <w:r>
-              <w:t>Pedidos</w:t>
-            </w:r>
-            <w:proofErr w:type="spellEnd"/>
-            <w:r>
-              <w:t>)</w:t>
+              <w:t>OQUT</w:t>
+            </w:r>
+            <w:r>
+              <w:rPr>
+                <w:lang w:val="es-MX"/>
+              </w:rPr>
+              <w:t xml:space="preserve"> (Cotizaciones)</w:t>
             </w:r>
           </w:p>
         </w:tc>
@@ -10732,7 +10205,7 @@
       <w:tr>
         <w:tc>
           <w:tcPr>
-            <w:tcW w:w="4713" w:type="dxa"/>
+            <w:tcW w:w="5144" w:type="dxa"/>
           </w:tcPr>
           <w:p>
             <w:pPr>
@@ -10742,13 +10215,13 @@
               </w:rPr>
             </w:pPr>
             <w:r>
-              <w:t>SENDDELIVERIES_DOCUMENTOSSAP</w:t>
+              <w:t>SENDPURCHASES_DOCUMENTOSSAP</w:t>
             </w:r>
           </w:p>
         </w:tc>
         <w:tc>
           <w:tcPr>
-            <w:tcW w:w="4071" w:type="dxa"/>
+            <w:tcW w:w="3640" w:type="dxa"/>
           </w:tcPr>
           <w:p>
             <w:pPr>
@@ -10758,15 +10231,7 @@
               </w:rPr>
             </w:pPr>
             <w:r>
-              <w:t>ODLN (</w:t>
-            </w:r>
-            <w:proofErr w:type="spellStart"/>
-            <w:r>
-              <w:t>Entregas</w:t>
-            </w:r>
-            <w:proofErr w:type="spellEnd"/>
-            <w:r>
-              <w:t>)</w:t>
+              <w:t>ORDR (Pedidos)</w:t>
             </w:r>
           </w:p>
         </w:tc>
@@ -10774,7 +10239,7 @@
       <w:tr>
         <w:tc>
           <w:tcPr>
-            <w:tcW w:w="4713" w:type="dxa"/>
+            <w:tcW w:w="5144" w:type="dxa"/>
           </w:tcPr>
           <w:p>
             <w:pPr>
@@ -10784,13 +10249,13 @@
               </w:rPr>
             </w:pPr>
             <w:r>
-              <w:t>SENDINVOICES_DOCUMENTOSSAP</w:t>
+              <w:t>SENDDELIVERIES_DOCUMENTOSSAP</w:t>
             </w:r>
           </w:p>
         </w:tc>
         <w:tc>
           <w:tcPr>
-            <w:tcW w:w="4071" w:type="dxa"/>
+            <w:tcW w:w="3640" w:type="dxa"/>
           </w:tcPr>
           <w:p>
             <w:pPr>
@@ -10800,7 +10265,7 @@
               </w:rPr>
             </w:pPr>
             <w:r>
-              <w:t>OINV (Facturas)</w:t>
+              <w:t>ODLN (Entregas)</w:t>
             </w:r>
           </w:p>
         </w:tc>
@@ -10808,7 +10273,7 @@
       <w:tr>
         <w:tc>
           <w:tcPr>
-            <w:tcW w:w="4713" w:type="dxa"/>
+            <w:tcW w:w="5144" w:type="dxa"/>
           </w:tcPr>
           <w:p>
             <w:pPr>
@@ -10818,13 +10283,13 @@
               </w:rPr>
             </w:pPr>
             <w:r>
-              <w:t>SENDCREDITNOTES_DOCUMENTOSSAP</w:t>
+              <w:t>SENDINVOICES_DOCUMENTOSSAP</w:t>
             </w:r>
           </w:p>
         </w:tc>
         <w:tc>
           <w:tcPr>
-            <w:tcW w:w="4071" w:type="dxa"/>
+            <w:tcW w:w="3640" w:type="dxa"/>
           </w:tcPr>
           <w:p>
             <w:pPr>
@@ -10834,15 +10299,7 @@
               </w:rPr>
             </w:pPr>
             <w:r>
-              <w:t>ORIN (</w:t>
-            </w:r>
-            <w:proofErr w:type="spellStart"/>
-            <w:r>
-              <w:t>Notas</w:t>
-            </w:r>
-            <w:proofErr w:type="spellEnd"/>
-            <w:r>
-              <w:t xml:space="preserve"> de Crédito)</w:t>
+              <w:t>OINV (Facturas)</w:t>
             </w:r>
           </w:p>
         </w:tc>
@@ -10850,7 +10307,7 @@
       <w:tr>
         <w:tc>
           <w:tcPr>
-            <w:tcW w:w="4713" w:type="dxa"/>
+            <w:tcW w:w="5144" w:type="dxa"/>
           </w:tcPr>
           <w:p>
             <w:pPr>
@@ -10860,13 +10317,13 @@
               </w:rPr>
             </w:pPr>
             <w:r>
-              <w:t>SENDPAYMENTS_DOCUMENTOSSAP</w:t>
+              <w:t>SENDCREDITNOTES_DOCUMENTOSSAP</w:t>
             </w:r>
           </w:p>
         </w:tc>
         <w:tc>
           <w:tcPr>
-            <w:tcW w:w="4071" w:type="dxa"/>
+            <w:tcW w:w="3640" w:type="dxa"/>
           </w:tcPr>
           <w:p>
             <w:pPr>
@@ -10876,7 +10333,7 @@
               </w:rPr>
             </w:pPr>
             <w:r>
-              <w:t>ORCT (Pagos)</w:t>
+              <w:t>ORIN (Notas de Crédito)</w:t>
             </w:r>
           </w:p>
         </w:tc>
@@ -10884,7 +10341,41 @@
       <w:tr>
         <w:tc>
           <w:tcPr>
-            <w:tcW w:w="4713" w:type="dxa"/>
+            <w:tcW w:w="5144" w:type="dxa"/>
+          </w:tcPr>
+          <w:p>
+            <w:pPr>
+              <w:jc w:val="both"/>
+              <w:rPr>
+                <w:lang w:val="es-MX"/>
+              </w:rPr>
+            </w:pPr>
+            <w:r>
+              <w:t>SENDPAYMENTS_DOCUMENTOSSAP</w:t>
+            </w:r>
+          </w:p>
+        </w:tc>
+        <w:tc>
+          <w:tcPr>
+            <w:tcW w:w="3640" w:type="dxa"/>
+          </w:tcPr>
+          <w:p>
+            <w:pPr>
+              <w:jc w:val="both"/>
+              <w:rPr>
+                <w:lang w:val="es-MX"/>
+              </w:rPr>
+            </w:pPr>
+            <w:r>
+              <w:t>ORCT (Pagos)</w:t>
+            </w:r>
+          </w:p>
+        </w:tc>
+      </w:tr>
+      <w:tr>
+        <w:tc>
+          <w:tcPr>
+            <w:tcW w:w="5144" w:type="dxa"/>
           </w:tcPr>
           <w:p>
             <w:pPr>
@@ -10900,7 +10391,7 @@
         </w:tc>
         <w:tc>
           <w:tcPr>
-            <w:tcW w:w="4071" w:type="dxa"/>
+            <w:tcW w:w="3640" w:type="dxa"/>
           </w:tcPr>
           <w:p>
             <w:pPr>
@@ -10913,13 +10404,8 @@
               <w:t>(Facturas</w:t>
             </w:r>
             <w:r>
-              <w:t xml:space="preserve"> de </w:t>
-            </w:r>
-            <w:proofErr w:type="spellStart"/>
-            <w:r>
-              <w:t>anticipo</w:t>
-            </w:r>
-            <w:proofErr w:type="spellEnd"/>
+              <w:t xml:space="preserve"> de anticipo</w:t>
+            </w:r>
             <w:r>
               <w:t>)</w:t>
             </w:r>
@@ -10932,7 +10418,7 @@
         </w:trPr>
         <w:tc>
           <w:tcPr>
-            <w:tcW w:w="4713" w:type="dxa"/>
+            <w:tcW w:w="5144" w:type="dxa"/>
           </w:tcPr>
           <w:p>
             <w:pPr>
@@ -10948,7 +10434,7 @@
         </w:tc>
         <w:tc>
           <w:tcPr>
-            <w:tcW w:w="4071" w:type="dxa"/>
+            <w:tcW w:w="3640" w:type="dxa"/>
           </w:tcPr>
           <w:p>
             <w:pPr>
@@ -10957,22 +10443,55 @@
                 <w:lang w:val="es-MX"/>
               </w:rPr>
             </w:pPr>
-            <w:proofErr w:type="spellStart"/>
-            <w:r>
-              <w:t>Cotizaciones</w:t>
-            </w:r>
-            <w:proofErr w:type="spellEnd"/>
-            <w:r>
-              <w:t xml:space="preserve"> </w:t>
-            </w:r>
-            <w:r>
-              <w:t xml:space="preserve">a </w:t>
-            </w:r>
-            <w:proofErr w:type="spellStart"/>
-            <w:r>
-              <w:t>Pedidos</w:t>
-            </w:r>
-            <w:proofErr w:type="spellEnd"/>
+            <w:r>
+              <w:t xml:space="preserve">Cotizaciones </w:t>
+            </w:r>
+            <w:r>
+              <w:t>a Pedidos</w:t>
+            </w:r>
+          </w:p>
+        </w:tc>
+      </w:tr>
+      <w:tr>
+        <w:trPr>
+          <w:trHeight w:val="50"/>
+        </w:trPr>
+        <w:tc>
+          <w:tcPr>
+            <w:tcW w:w="5144" w:type="dxa"/>
+          </w:tcPr>
+          <w:p>
+            <w:pPr>
+              <w:jc w:val="both"/>
+            </w:pPr>
+            <w:r>
+              <w:rPr>
+                <w:lang w:val="es-MX"/>
+              </w:rPr>
+              <w:t>RECEIVEQUOTATIONS</w:t>
+            </w:r>
+          </w:p>
+        </w:tc>
+        <w:tc>
+          <w:tcPr>
+            <w:tcW w:w="3640" w:type="dxa"/>
+          </w:tcPr>
+          <w:p>
+            <w:pPr>
+              <w:jc w:val="both"/>
+            </w:pPr>
+            <w:r>
+              <w:rPr>
+                <w:lang w:val="es-MX"/>
+              </w:rPr>
+              <w:t>OQUT</w:t>
+            </w:r>
+            <w:r>
+              <w:rPr>
+                <w:lang w:val="es-MX"/>
+              </w:rPr>
+              <w:t xml:space="preserve"> (Cotizaciones)</w:t>
+            </w:r>
           </w:p>
         </w:tc>
       </w:tr>
@@ -11102,7 +10621,6 @@
         </w:rPr>
         <w:t xml:space="preserve"> El programa formatea los datos, genera el paquete en formato JSON estructurado y realiza una petición digital de tipo </w:t>
       </w:r>
-      <w:proofErr w:type="spellStart"/>
       <w:r>
         <w:rPr>
           <w:i/>
@@ -11111,7 +10629,6 @@
         </w:rPr>
         <w:t>Upsert</w:t>
       </w:r>
-      <w:proofErr w:type="spellEnd"/>
       <w:r>
         <w:rPr>
           <w:lang w:val="es-MX"/>
@@ -11279,7 +10796,6 @@
         </w:rPr>
         <w:t xml:space="preserve"> El programa localiza de manera inteligente el archivo PDF adjunto en el equipo y lo sube temporalmente a Zoho Files para obtener un identificador único (</w:t>
       </w:r>
-      <w:proofErr w:type="spellStart"/>
       <w:r>
         <w:rPr>
           <w:i/>
@@ -11288,7 +10804,6 @@
         </w:rPr>
         <w:t>file_id</w:t>
       </w:r>
-      <w:proofErr w:type="spellEnd"/>
       <w:r>
         <w:rPr>
           <w:lang w:val="es-MX"/>
@@ -11319,21 +10834,7 @@
         <w:rPr>
           <w:lang w:val="es-MX"/>
         </w:rPr>
-        <w:t xml:space="preserve"> Se empaqueta toda la estructura junto con sus </w:t>
-      </w:r>
-      <w:proofErr w:type="spellStart"/>
-      <w:r>
-        <w:rPr>
-          <w:lang w:val="es-MX"/>
-        </w:rPr>
-        <w:t>subnodos</w:t>
-      </w:r>
-      <w:proofErr w:type="spellEnd"/>
-      <w:r>
-        <w:rPr>
-          <w:lang w:val="es-MX"/>
-        </w:rPr>
-        <w:t xml:space="preserve"> y se transmite hacia el CRM. </w:t>
+        <w:t xml:space="preserve"> Se empaqueta toda la estructura junto con sus subnodos y se transmite hacia el CRM. </w:t>
       </w:r>
     </w:p>
     <w:p>
@@ -11509,21 +11010,7 @@
         <w:rPr>
           <w:lang w:val="es-MX"/>
         </w:rPr>
-        <w:t xml:space="preserve"> El campo personalizado </w:t>
-      </w:r>
-      <w:proofErr w:type="spellStart"/>
-      <w:r>
-        <w:rPr>
-          <w:lang w:val="es-MX"/>
-        </w:rPr>
-        <w:t>AVS_Zoho_Sync</w:t>
-      </w:r>
-      <w:proofErr w:type="spellEnd"/>
-      <w:r>
-        <w:rPr>
-          <w:lang w:val="es-MX"/>
-        </w:rPr>
-        <w:t xml:space="preserve"> de la factura o entrega cambia su valor para reflejar que la operación ha sido atendida. </w:t>
+        <w:t xml:space="preserve"> El campo personalizado AVS_Zoho_Sync de la factura o entrega cambia su valor para reflejar que la operación ha sido atendida. </w:t>
       </w:r>
     </w:p>
     <w:p>
@@ -11632,21 +11119,7 @@
         <w:rPr>
           <w:lang w:val="es-MX"/>
         </w:rPr>
-        <w:t xml:space="preserve"> Mediante la ejecución del comando RECEIVEPURCHASES, el motor consulta el </w:t>
-      </w:r>
-      <w:proofErr w:type="spellStart"/>
-      <w:r>
-        <w:rPr>
-          <w:lang w:val="es-MX"/>
-        </w:rPr>
-        <w:t>endpoint</w:t>
-      </w:r>
-      <w:proofErr w:type="spellEnd"/>
-      <w:r>
-        <w:rPr>
-          <w:lang w:val="es-MX"/>
-        </w:rPr>
-        <w:t xml:space="preserve"> de cotizaciones pendientes. </w:t>
+        <w:t xml:space="preserve"> Mediante la ejecución del comando RECEIVEPURCHASES, el motor consulta el endpoint de cotizaciones pendientes. </w:t>
       </w:r>
     </w:p>
     <w:p>
@@ -11698,21 +11171,7 @@
         <w:rPr>
           <w:lang w:val="es-MX"/>
         </w:rPr>
-        <w:t xml:space="preserve"> Utilizando transacciones controladas de SAP DI API (</w:t>
-      </w:r>
-      <w:proofErr w:type="spellStart"/>
-      <w:r>
-        <w:rPr>
-          <w:lang w:val="es-MX"/>
-        </w:rPr>
-        <w:t>StartTransaction</w:t>
-      </w:r>
-      <w:proofErr w:type="spellEnd"/>
-      <w:r>
-        <w:rPr>
-          <w:lang w:val="es-MX"/>
-        </w:rPr>
-        <w:t xml:space="preserve">), el sistema asegura que la creación de datos sea íntegra. </w:t>
+        <w:t xml:space="preserve"> Utilizando transacciones controladas de SAP DI API (StartTransaction), el sistema asegura que la creación de datos sea íntegra. </w:t>
       </w:r>
     </w:p>
     <w:p>
@@ -11842,21 +11301,7 @@
         <w:rPr>
           <w:lang w:val="es-MX"/>
         </w:rPr>
-        <w:t xml:space="preserve">Paso 4 (El detalle del fallo): Guarda un mensaje descriptivo del problema en el campo de usuario </w:t>
-      </w:r>
-      <w:proofErr w:type="spellStart"/>
-      <w:r>
-        <w:rPr>
-          <w:lang w:val="es-MX"/>
-        </w:rPr>
-        <w:t>AVS_Zoho_ProcResult</w:t>
-      </w:r>
-      <w:proofErr w:type="spellEnd"/>
-      <w:r>
-        <w:rPr>
-          <w:lang w:val="es-MX"/>
-        </w:rPr>
-        <w:t xml:space="preserve">. </w:t>
+        <w:t xml:space="preserve">Paso 4 (El detalle del fallo): Guarda un mensaje descriptivo del problema en el campo de usuario AVS_Zoho_ProcResult. </w:t>
       </w:r>
     </w:p>
     <w:p>
@@ -12169,23 +11614,13 @@
         </w:rPr>
         <w:t xml:space="preserve"> o </w:t>
       </w:r>
-      <w:proofErr w:type="spellStart"/>
       <w:r>
         <w:rPr>
           <w:i/>
           <w:iCs/>
           <w:lang w:val="es-MX"/>
         </w:rPr>
-        <w:t>Refresh</w:t>
-      </w:r>
-      <w:proofErr w:type="spellEnd"/>
-      <w:r>
-        <w:rPr>
-          <w:i/>
-          <w:iCs/>
-          <w:lang w:val="es-MX"/>
-        </w:rPr>
-        <w:t xml:space="preserve"> Token</w:t>
+        <w:t>Refresh Token</w:t>
       </w:r>
       <w:r>
         <w:rPr>
@@ -12217,39 +11652,15 @@
         <w:rPr>
           <w:lang w:val="es-MX"/>
         </w:rPr>
-        <w:t xml:space="preserve"> Abra la interfaz de configuración (</w:t>
-      </w:r>
-      <w:proofErr w:type="spellStart"/>
-      <w:r>
-        <w:rPr>
-          <w:lang w:val="es-MX"/>
-        </w:rPr>
-        <w:t>AVS_AppConfig</w:t>
-      </w:r>
-      <w:proofErr w:type="spellEnd"/>
-      <w:r>
-        <w:rPr>
-          <w:lang w:val="es-MX"/>
-        </w:rPr>
-        <w:t xml:space="preserve">), verifique los datos de acceso de Zoho en la sociedad correspondiente y asegúrese de actualizar el </w:t>
-      </w:r>
-      <w:proofErr w:type="spellStart"/>
+        <w:t xml:space="preserve"> Abra la interfaz de configuración (AVS_AppConfig), verifique los datos de acceso de Zoho en la sociedad correspondiente y asegúrese de actualizar el </w:t>
+      </w:r>
       <w:r>
         <w:rPr>
           <w:i/>
           <w:iCs/>
           <w:lang w:val="es-MX"/>
         </w:rPr>
-        <w:t>Refresh</w:t>
-      </w:r>
-      <w:proofErr w:type="spellEnd"/>
-      <w:r>
-        <w:rPr>
-          <w:i/>
-          <w:iCs/>
-          <w:lang w:val="es-MX"/>
-        </w:rPr>
-        <w:t xml:space="preserve"> Token</w:t>
+        <w:t>Refresh Token</w:t>
       </w:r>
       <w:r>
         <w:rPr>
@@ -12355,35 +11766,7 @@
         <w:rPr>
           <w:lang w:val="es-MX"/>
         </w:rPr>
-        <w:t xml:space="preserve"> Ingrese al panel de configuración general de entidades (</w:t>
-      </w:r>
-      <w:proofErr w:type="spellStart"/>
-      <w:r>
-        <w:rPr>
-          <w:lang w:val="es-MX"/>
-        </w:rPr>
-        <w:t>AVS_AppConfig</w:t>
-      </w:r>
-      <w:proofErr w:type="spellEnd"/>
-      <w:r>
-        <w:rPr>
-          <w:lang w:val="es-MX"/>
-        </w:rPr>
-        <w:t xml:space="preserve">), agregue la clave correspondiente (por ejemplo, OITM o ORDR) y configure sus campos y </w:t>
-      </w:r>
-      <w:proofErr w:type="spellStart"/>
-      <w:r>
-        <w:rPr>
-          <w:lang w:val="es-MX"/>
-        </w:rPr>
-        <w:t>endpoints</w:t>
-      </w:r>
-      <w:proofErr w:type="spellEnd"/>
-      <w:r>
-        <w:rPr>
-          <w:lang w:val="es-MX"/>
-        </w:rPr>
-        <w:t xml:space="preserve"> de API. </w:t>
+        <w:t xml:space="preserve"> Ingrese al panel de configuración general de entidades (AVS_AppConfig), agregue la clave correspondiente (por ejemplo, OITM o ORDR) y configure sus campos y endpoints de API. </w:t>
       </w:r>
     </w:p>
     <w:p>
@@ -12401,21 +11784,7 @@
         <w:rPr>
           <w:lang w:val="es-MX"/>
         </w:rPr>
-        <w:t>Mensaje: "No se definió '</w:t>
-      </w:r>
-      <w:proofErr w:type="spellStart"/>
-      <w:r>
-        <w:rPr>
-          <w:lang w:val="es-MX"/>
-        </w:rPr>
-        <w:t>SapKeyField</w:t>
-      </w:r>
-      <w:proofErr w:type="spellEnd"/>
-      <w:r>
-        <w:rPr>
-          <w:lang w:val="es-MX"/>
-        </w:rPr>
-        <w:t xml:space="preserve">' en la configuración </w:t>
+        <w:t xml:space="preserve">Mensaje: "No se definió 'SapKeyField' en la configuración </w:t>
       </w:r>
       <w:r>
         <w:rPr>
@@ -12482,7 +11851,6 @@
         </w:rPr>
         <w:t xml:space="preserve"> Modifique la configuración de la entidad en el panel visual y asegúrese de definir correctamente el campo clave de SAP (</w:t>
       </w:r>
-      <w:proofErr w:type="spellStart"/>
       <w:r>
         <w:rPr>
           <w:i/>
@@ -12491,7 +11859,6 @@
         </w:rPr>
         <w:t>SapKeyField</w:t>
       </w:r>
-      <w:proofErr w:type="spellEnd"/>
       <w:r>
         <w:rPr>
           <w:lang w:val="es-MX"/>
@@ -12550,21 +11917,7 @@
         <w:rPr>
           <w:lang w:val="es-MX"/>
         </w:rPr>
-        <w:t xml:space="preserve">Mensaje: "El archivo adjunto del </w:t>
-      </w:r>
-      <w:proofErr w:type="spellStart"/>
-      <w:r>
-        <w:rPr>
-          <w:lang w:val="es-MX"/>
-        </w:rPr>
-        <w:t>subnodo</w:t>
-      </w:r>
-      <w:proofErr w:type="spellEnd"/>
-      <w:r>
-        <w:rPr>
-          <w:lang w:val="es-MX"/>
-        </w:rPr>
-        <w:t xml:space="preserve"> no existe en disco"</w:t>
+        <w:t>Mensaje: "El archivo adjunto del subnodo no existe en disco"</w:t>
       </w:r>
     </w:p>
     <w:p>
@@ -12634,21 +11987,7 @@
         <w:rPr>
           <w:lang w:val="es-MX"/>
         </w:rPr>
-        <w:t xml:space="preserve">Mensaje: "El método </w:t>
-      </w:r>
-      <w:proofErr w:type="spellStart"/>
-      <w:r>
-        <w:rPr>
-          <w:lang w:val="es-MX"/>
-        </w:rPr>
-        <w:t>SubirArchivoObtenerIdAsync</w:t>
-      </w:r>
-      <w:proofErr w:type="spellEnd"/>
-      <w:r>
-        <w:rPr>
-          <w:lang w:val="es-MX"/>
-        </w:rPr>
-        <w:t xml:space="preserve"> no devolvió un File ID válido"</w:t>
+        <w:t>Mensaje: "El método SubirArchivoObtenerIdAsync no devolvió un File ID válido"</w:t>
       </w:r>
     </w:p>
     <w:p>
@@ -12806,21 +12145,7 @@
         <w:rPr>
           <w:lang w:val="es-MX"/>
         </w:rPr>
-        <w:t xml:space="preserve"> Ingrese a Zoho CRM, edite la cotización correspondiente, asígnele una cuenta que tenga su </w:t>
-      </w:r>
-      <w:proofErr w:type="gramStart"/>
-      <w:r>
-        <w:rPr>
-          <w:lang w:val="es-MX"/>
-        </w:rPr>
-        <w:t>respectivo RFC</w:t>
-      </w:r>
-      <w:proofErr w:type="gramEnd"/>
-      <w:r>
-        <w:rPr>
-          <w:lang w:val="es-MX"/>
-        </w:rPr>
-        <w:t xml:space="preserve"> configurado y vuelva a ejecutar el proceso de recepción. </w:t>
+        <w:t xml:space="preserve"> Ingrese a Zoho CRM, edite la cotización correspondiente, asígnele una cuenta que tenga su respectivo RFC configurado y vuelva a ejecutar el proceso de recepción. </w:t>
       </w:r>
     </w:p>
     <w:p>
@@ -12839,21 +12164,7 @@
           <w:lang w:val="es-MX"/>
         </w:rPr>
         <w:lastRenderedPageBreak/>
-        <w:t xml:space="preserve">Mensaje: "La cuenta [ID] no tiene configurado un </w:t>
-      </w:r>
-      <w:proofErr w:type="gramStart"/>
-      <w:r>
-        <w:rPr>
-          <w:lang w:val="es-MX"/>
-        </w:rPr>
-        <w:t>RFC válido</w:t>
-      </w:r>
-      <w:proofErr w:type="gramEnd"/>
-      <w:r>
-        <w:rPr>
-          <w:lang w:val="es-MX"/>
-        </w:rPr>
-        <w:t>."</w:t>
+        <w:t>Mensaje: "La cuenta [ID] no tiene configurado un RFC válido."</w:t>
       </w:r>
     </w:p>
     <w:p>
@@ -12905,21 +12216,7 @@
         <w:rPr>
           <w:lang w:val="es-MX"/>
         </w:rPr>
-        <w:t xml:space="preserve"> Abra el perfil de la cuenta en Zoho CRM, capture el </w:t>
-      </w:r>
-      <w:proofErr w:type="gramStart"/>
-      <w:r>
-        <w:rPr>
-          <w:lang w:val="es-MX"/>
-        </w:rPr>
-        <w:t>RFC correcto</w:t>
-      </w:r>
-      <w:proofErr w:type="gramEnd"/>
-      <w:r>
-        <w:rPr>
-          <w:lang w:val="es-MX"/>
-        </w:rPr>
-        <w:t xml:space="preserve"> en su campo correspondiente y repita la sincronización. </w:t>
+        <w:t xml:space="preserve"> Abra el perfil de la cuenta en Zoho CRM, capture el RFC correcto en su campo correspondiente y repita la sincronización. </w:t>
       </w:r>
     </w:p>
     <w:p>
@@ -13124,37 +12421,12 @@
       <w:pPr>
         <w:jc w:val="both"/>
       </w:pPr>
-      <w:proofErr w:type="spellStart"/>
       <w:r>
         <w:rPr>
           <w:b/>
           <w:bCs/>
         </w:rPr>
-        <w:t>Área</w:t>
-      </w:r>
-      <w:proofErr w:type="spellEnd"/>
-      <w:r>
-        <w:rPr>
-          <w:b/>
-          <w:bCs/>
-        </w:rPr>
-        <w:t xml:space="preserve"> de </w:t>
-      </w:r>
-      <w:proofErr w:type="spellStart"/>
-      <w:r>
-        <w:rPr>
-          <w:b/>
-          <w:bCs/>
-        </w:rPr>
-        <w:t>Soporte</w:t>
-      </w:r>
-      <w:proofErr w:type="spellEnd"/>
-      <w:r>
-        <w:rPr>
-          <w:b/>
-          <w:bCs/>
-        </w:rPr>
-        <w:t xml:space="preserve"> Técnico - AVANTIS </w:t>
+        <w:t xml:space="preserve">Área de Soporte Técnico - AVANTIS </w:t>
       </w:r>
     </w:p>
     <w:p>
@@ -13171,23 +12443,7 @@
           <w:b/>
           <w:bCs/>
         </w:rPr>
-        <w:t xml:space="preserve">Correo </w:t>
-      </w:r>
-      <w:proofErr w:type="spellStart"/>
-      <w:r>
-        <w:rPr>
-          <w:b/>
-          <w:bCs/>
-        </w:rPr>
-        <w:t>electrónico</w:t>
-      </w:r>
-      <w:proofErr w:type="spellEnd"/>
-      <w:r>
-        <w:rPr>
-          <w:b/>
-          <w:bCs/>
-        </w:rPr>
-        <w:t xml:space="preserve">: </w:t>
+        <w:t xml:space="preserve">Correo electrónico: </w:t>
       </w:r>
       <w:r>
         <w:t xml:space="preserve">soporte@avantis.mx </w:t>
@@ -13213,47 +12469,11 @@
         </w:rPr>
         <w:t xml:space="preserve">Horario de atención: </w:t>
       </w:r>
-      <w:proofErr w:type="gramStart"/>
-      <w:r>
-        <w:rPr>
-          <w:lang w:val="es-MX"/>
-        </w:rPr>
-        <w:t>Lunes</w:t>
-      </w:r>
-      <w:proofErr w:type="gramEnd"/>
-      <w:r>
-        <w:rPr>
-          <w:lang w:val="es-MX"/>
-        </w:rPr>
-        <w:t xml:space="preserve"> a </w:t>
-      </w:r>
-      <w:proofErr w:type="gramStart"/>
-      <w:r>
-        <w:rPr>
-          <w:lang w:val="es-MX"/>
-        </w:rPr>
-        <w:t>Viernes</w:t>
-      </w:r>
-      <w:proofErr w:type="gramEnd"/>
-      <w:r>
-        <w:rPr>
-          <w:lang w:val="es-MX"/>
-        </w:rPr>
-        <w:t xml:space="preserve">, 09:00 - 18:00 </w:t>
-      </w:r>
-      <w:proofErr w:type="spellStart"/>
-      <w:r>
-        <w:rPr>
-          <w:lang w:val="es-MX"/>
-        </w:rPr>
-        <w:t>hrs</w:t>
-      </w:r>
-      <w:proofErr w:type="spellEnd"/>
-      <w:r>
-        <w:rPr>
-          <w:lang w:val="es-MX"/>
-        </w:rPr>
-        <w:t xml:space="preserve">. </w:t>
+      <w:r>
+        <w:rPr>
+          <w:lang w:val="es-MX"/>
+        </w:rPr>
+        <w:t xml:space="preserve">Lunes a Viernes, 09:00 - 18:00 hrs. </w:t>
       </w:r>
     </w:p>
     <w:sectPr>
@@ -19694,7 +18914,6 @@
   <w:style w:type="character" w:default="1" w:styleId="Fuentedeprrafopredeter">
     <w:name w:val="Default Paragraph Font"/>
     <w:uiPriority w:val="1"/>
-    <w:semiHidden/>
     <w:unhideWhenUsed/>
   </w:style>
   <w:style w:type="table" w:default="1" w:styleId="Tablanormal">

</xml_diff>